<commit_message>
Integrate medicinal lookup, image enrichment and reference view enhancements
</commit_message>
<xml_diff>
--- a/docs/GreenThumb_PFAF_Spec.docx
+++ b/docs/GreenThumb_PFAF_Spec.docx
@@ -1,6 +1,6 @@
 
 <file path=word/document.xml><?xml version="1.0" encoding="utf-8"?>
-<w:document xmlns:wpc="http://schemas.microsoft.com/office/word/2010/wordprocessingCanvas" xmlns:cx="http://schemas.microsoft.com/office/drawing/2014/chartex" xmlns:cx1="http://schemas.microsoft.com/office/drawing/2015/9/8/chartex" xmlns:cx2="http://schemas.microsoft.com/office/drawing/2015/10/21/chartex" xmlns:cx3="http://schemas.microsoft.com/office/drawing/2016/5/9/chartex" xmlns:cx4="http://schemas.microsoft.com/office/drawing/2016/5/10/chartex" xmlns:cx5="http://schemas.microsoft.com/office/drawing/2016/5/11/chartex" xmlns:cx6="http://schemas.microsoft.com/office/drawing/2016/5/12/chartex" xmlns:cx7="http://schemas.microsoft.com/office/drawing/2016/5/13/chartex" xmlns:cx8="http://schemas.microsoft.com/office/drawing/2016/5/14/chartex" xmlns:mc="http://schemas.openxmlformats.org/markup-compatibility/2006" xmlns:aink="http://schemas.microsoft.com/office/drawing/2016/ink" xmlns:am3d="http://schemas.microsoft.com/office/drawing/2017/model3d" xmlns:o="urn:schemas-microsoft-com:office:office" xmlns:oel="http://schemas.microsoft.com/office/2019/extlst" xmlns:r="http://schemas.openxmlformats.org/officeDocument/2006/relationships" xmlns:m="http://schemas.openxmlformats.org/officeDocument/2006/math" xmlns:v="urn:schemas-microsoft-com:vml" xmlns:wp14="http://schemas.microsoft.com/office/word/2010/wordprocessingDrawing" xmlns:wp="http://schemas.openxmlformats.org/drawingml/2006/wordprocessingDrawing" xmlns:w10="urn:schemas-microsoft-com:office:word" xmlns:w="http://schemas.openxmlformats.org/wordprocessingml/2006/main" xmlns:w14="http://schemas.microsoft.com/office/word/2010/wordml" xmlns:w15="http://schemas.microsoft.com/office/word/2012/wordml" xmlns:w16cex="http://schemas.microsoft.com/office/word/2018/wordml/cex" xmlns:w16cid="http://schemas.microsoft.com/office/word/2016/wordml/cid" xmlns:w16="http://schemas.microsoft.com/office/word/2018/wordml" xmlns:w16du="http://schemas.microsoft.com/office/word/2023/wordml/word16du" xmlns:w16sdtdh="http://schemas.microsoft.com/office/word/2020/wordml/sdtdatahash" xmlns:w16sdtfl="http://schemas.microsoft.com/office/word/2024/wordml/sdtformatlock" xmlns:w16se="http://schemas.microsoft.com/office/word/2015/wordml/symex" xmlns:wpg="http://schemas.microsoft.com/office/word/2010/wordprocessingGroup" xmlns:wpi="http://schemas.microsoft.com/office/word/2010/wordprocessingInk" xmlns:wne="http://schemas.microsoft.com/office/word/2006/wordml" xmlns:wps="http://schemas.microsoft.com/office/word/2010/wordprocessingShape" mc:Ignorable="w14 w15 w16se w16cid w16 w16cex w16sdtdh w16sdtfl w16du wp14">
+<w:document xmlns:wpc="http://schemas.microsoft.com/office/word/2010/wordprocessingCanvas" xmlns:cx="http://schemas.microsoft.com/office/drawing/2014/chartex" xmlns:cx1="http://schemas.microsoft.com/office/drawing/2015/9/8/chartex" xmlns:cx2="http://schemas.microsoft.com/office/drawing/2015/10/21/chartex" xmlns:cx3="http://schemas.microsoft.com/office/drawing/2016/5/9/chartex" xmlns:cx4="http://schemas.microsoft.com/office/drawing/2016/5/10/chartex" xmlns:cx5="http://schemas.microsoft.com/office/drawing/2016/5/11/chartex" xmlns:cx6="http://schemas.microsoft.com/office/drawing/2016/5/12/chartex" xmlns:cx7="http://schemas.microsoft.com/office/drawing/2016/5/13/chartex" xmlns:cx8="http://schemas.microsoft.com/office/drawing/2016/5/14/chartex" xmlns:mc="http://schemas.openxmlformats.org/markup-compatibility/2006" xmlns:aink="http://schemas.microsoft.com/office/drawing/2016/ink" xmlns:am3d="http://schemas.microsoft.com/office/drawing/2017/model3d" xmlns:o="urn:schemas-microsoft-com:office:office" xmlns:oel="http://schemas.microsoft.com/office/2019/extlst" xmlns:r="http://schemas.openxmlformats.org/officeDocument/2006/relationships" xmlns:m="http://schemas.openxmlformats.org/officeDocument/2006/math" xmlns:v="urn:schemas-microsoft-com:vml" xmlns:wp14="http://schemas.microsoft.com/office/word/2010/wordprocessingDrawing" xmlns:wp="http://schemas.openxmlformats.org/drawingml/2006/wordprocessingDrawing" xmlns:w10="urn:schemas-microsoft-com:office:word" xmlns:w="http://schemas.openxmlformats.org/wordprocessingml/2006/main" xmlns:w14="http://schemas.microsoft.com/office/word/2010/wordml" xmlns:w15="http://schemas.microsoft.com/office/word/2012/wordml" xmlns:w16cei="http://schemas.microsoft.com/office/word/2026/wordml/cei" xmlns:w16cex="http://schemas.microsoft.com/office/word/2018/wordml/cex" xmlns:w16cid="http://schemas.microsoft.com/office/word/2016/wordml/cid" xmlns:w16="http://schemas.microsoft.com/office/word/2018/wordml" xmlns:w16du="http://schemas.microsoft.com/office/word/2023/wordml/word16du" xmlns:w16sdtdh="http://schemas.microsoft.com/office/word/2020/wordml/sdtdatahash" xmlns:w16sdtfl="http://schemas.microsoft.com/office/word/2024/wordml/sdtformatlock" xmlns:w16se="http://schemas.microsoft.com/office/word/2015/wordml/symex" xmlns:wpg="http://schemas.microsoft.com/office/word/2010/wordprocessingGroup" xmlns:wpi="http://schemas.microsoft.com/office/word/2010/wordprocessingInk" xmlns:wne="http://schemas.microsoft.com/office/word/2006/wordml" xmlns:wps="http://schemas.microsoft.com/office/word/2010/wordprocessingShape" mc:Ignorable="w14 w15 w16se w16cid w16 w16cex w16sdtdh w16sdtfl w16du wp14">
   <w:body>
     <w:p>
       <w:pPr>
@@ -12,7 +12,23 @@
     </w:p>
     <w:p>
       <w:r>
-        <w:t>This document defines the integration approach for Plants For A Future (PFAF) as a structured enrichment source in the Ker-Huella pipeline.</w:t>
+        <w:t xml:space="preserve">This document defines the integration approach for Plants </w:t>
+      </w:r>
+      <w:proofErr w:type="gramStart"/>
+      <w:r>
+        <w:t>For</w:t>
+      </w:r>
+      <w:proofErr w:type="gramEnd"/>
+      <w:r>
+        <w:t xml:space="preserve"> </w:t>
+      </w:r>
+      <w:proofErr w:type="gramStart"/>
+      <w:r>
+        <w:t>A</w:t>
+      </w:r>
+      <w:proofErr w:type="gramEnd"/>
+      <w:r>
+        <w:t xml:space="preserve"> Future (PFAF) as a structured enrichment source in the Ker-Huella pipeline.</w:t>
       </w:r>
     </w:p>
     <w:p>
@@ -124,7 +140,15 @@
         <w:pStyle w:val="ListBullet"/>
       </w:pPr>
       <w:r>
-        <w:t>Use seed_plants as input list.</w:t>
+        <w:t xml:space="preserve">Use </w:t>
+      </w:r>
+      <w:proofErr w:type="spellStart"/>
+      <w:r>
+        <w:t>seed_plants</w:t>
+      </w:r>
+      <w:proofErr w:type="spellEnd"/>
+      <w:r>
+        <w:t xml:space="preserve"> as input list.</w:t>
       </w:r>
     </w:p>
     <w:p>
@@ -171,40 +195,73 @@
       <w:pPr>
         <w:pStyle w:val="ListBullet"/>
       </w:pPr>
+      <w:proofErr w:type="spellStart"/>
       <w:r>
-        <w:t>plant_reference: identity data.</w:t>
+        <w:t>plant_reference</w:t>
+      </w:r>
+      <w:proofErr w:type="spellEnd"/>
+      <w:r>
+        <w:t>: identity data.</w:t>
       </w:r>
     </w:p>
     <w:p>
       <w:pPr>
         <w:pStyle w:val="ListBullet"/>
       </w:pPr>
+      <w:proofErr w:type="spellStart"/>
       <w:r>
-        <w:t>plant_reference_uses: edible, medicinal, other uses.</w:t>
+        <w:t>plant_reference_</w:t>
+      </w:r>
+      <w:proofErr w:type="gramStart"/>
+      <w:r>
+        <w:t>uses</w:t>
+      </w:r>
+      <w:proofErr w:type="spellEnd"/>
+      <w:r>
+        <w:t>:</w:t>
+      </w:r>
+      <w:proofErr w:type="gramEnd"/>
+      <w:r>
+        <w:t xml:space="preserve"> edible, medicinal, other uses.</w:t>
       </w:r>
     </w:p>
     <w:p>
       <w:pPr>
         <w:pStyle w:val="ListBullet"/>
       </w:pPr>
+      <w:proofErr w:type="spellStart"/>
       <w:r>
-        <w:t>plant_reference_safety: hazards and warnings.</w:t>
+        <w:t>plant_reference_safety</w:t>
+      </w:r>
+      <w:proofErr w:type="spellEnd"/>
+      <w:r>
+        <w:t>: hazards and warnings.</w:t>
       </w:r>
     </w:p>
     <w:p>
       <w:pPr>
         <w:pStyle w:val="ListBullet"/>
       </w:pPr>
+      <w:proofErr w:type="spellStart"/>
       <w:r>
-        <w:t>plant_reference_harvest: plant parts and notes.</w:t>
+        <w:t>plant_reference_harvest</w:t>
+      </w:r>
+      <w:proofErr w:type="spellEnd"/>
+      <w:r>
+        <w:t>: plant parts and notes.</w:t>
       </w:r>
     </w:p>
     <w:p>
       <w:pPr>
         <w:pStyle w:val="ListBullet"/>
       </w:pPr>
+      <w:proofErr w:type="spellStart"/>
       <w:r>
-        <w:t>plant_reference_ratings: edible and medicinal scores.</w:t>
+        <w:t>plant_reference_ratings</w:t>
+      </w:r>
+      <w:proofErr w:type="spellEnd"/>
+      <w:r>
+        <w:t>: edible and medicinal scores.</w:t>
       </w:r>
     </w:p>
     <w:p>
@@ -244,8 +301,13 @@
       <w:pPr>
         <w:pStyle w:val="ListBullet"/>
       </w:pPr>
+      <w:proofErr w:type="gramStart"/>
       <w:r>
-        <w:t>Known Hazards</w:t>
+        <w:t>Known</w:t>
+      </w:r>
+      <w:proofErr w:type="gramEnd"/>
+      <w:r>
+        <w:t xml:space="preserve"> Hazards</w:t>
       </w:r>
     </w:p>
     <w:p>
@@ -283,34 +345,418 @@
     <w:p>
       <w:pPr>
         <w:pStyle w:val="ListBullet"/>
+        <w:numPr>
+          <w:ilvl w:val="0"/>
+          <w:numId w:val="0"/>
+        </w:numPr>
+        <w:spacing w:after="0" w:line="240" w:lineRule="auto"/>
       </w:pPr>
       <w:r>
-        <w:t>New script: 23_enrich_pfaf.R</w:t>
+        <w:t xml:space="preserve">Stage </w:t>
+      </w:r>
+      <w:proofErr w:type="gramStart"/>
+      <w:r>
+        <w:t>20  PFAF</w:t>
+      </w:r>
+      <w:proofErr w:type="gramEnd"/>
+      <w:r>
+        <w:t xml:space="preserve"> Extraction</w:t>
       </w:r>
     </w:p>
     <w:p>
       <w:pPr>
         <w:pStyle w:val="ListBullet"/>
+        <w:numPr>
+          <w:ilvl w:val="0"/>
+          <w:numId w:val="0"/>
+        </w:numPr>
+        <w:spacing w:after="0" w:line="240" w:lineRule="auto"/>
+        <w:rPr>
+          <w:rFonts w:hint="eastAsia"/>
+        </w:rPr>
       </w:pPr>
       <w:r>
-        <w:t>Runs after plant identity stage.</w:t>
+        <w:rPr>
+          <w:rFonts w:hint="eastAsia"/>
+        </w:rPr>
+        <w:t xml:space="preserve">    </w:t>
+      </w:r>
+      <w:r>
+        <w:rPr>
+          <w:rFonts w:hint="eastAsia"/>
+        </w:rPr>
+        <w:t>↓</w:t>
       </w:r>
     </w:p>
     <w:p>
       <w:pPr>
         <w:pStyle w:val="ListBullet"/>
-      </w:pPr>
+        <w:numPr>
+          <w:ilvl w:val="0"/>
+          <w:numId w:val="0"/>
+        </w:numPr>
+        <w:spacing w:after="0" w:line="240" w:lineRule="auto"/>
+      </w:pPr>
+      <w:proofErr w:type="spellStart"/>
       <w:r>
-        <w:t>Outputs to plant_reference tables.</w:t>
+        <w:t>plant_reference_raw</w:t>
+      </w:r>
+      <w:proofErr w:type="spellEnd"/>
+    </w:p>
+    <w:p>
+      <w:pPr>
+        <w:pStyle w:val="ListBullet"/>
+        <w:numPr>
+          <w:ilvl w:val="0"/>
+          <w:numId w:val="0"/>
+        </w:numPr>
+        <w:spacing w:after="0" w:line="240" w:lineRule="auto"/>
+      </w:pPr>
+    </w:p>
+    <w:p>
+      <w:pPr>
+        <w:pStyle w:val="ListBullet"/>
+        <w:numPr>
+          <w:ilvl w:val="0"/>
+          <w:numId w:val="0"/>
+        </w:numPr>
+        <w:spacing w:after="0" w:line="240" w:lineRule="auto"/>
+      </w:pPr>
+      <w:r>
+        <w:t xml:space="preserve">Stage </w:t>
+      </w:r>
+      <w:proofErr w:type="gramStart"/>
+      <w:r>
+        <w:t>21  PFAF</w:t>
+      </w:r>
+      <w:proofErr w:type="gramEnd"/>
+      <w:r>
+        <w:t xml:space="preserve"> Parsing</w:t>
       </w:r>
     </w:p>
     <w:p>
       <w:pPr>
         <w:pStyle w:val="ListBullet"/>
+        <w:numPr>
+          <w:ilvl w:val="0"/>
+          <w:numId w:val="0"/>
+        </w:numPr>
+        <w:spacing w:after="0" w:line="240" w:lineRule="auto"/>
+        <w:rPr>
+          <w:rFonts w:hint="eastAsia"/>
+        </w:rPr>
       </w:pPr>
       <w:r>
-        <w:t>Joined later in plant_card_view.</w:t>
+        <w:rPr>
+          <w:rFonts w:hint="eastAsia"/>
+        </w:rPr>
+        <w:t xml:space="preserve">    </w:t>
       </w:r>
+      <w:r>
+        <w:rPr>
+          <w:rFonts w:hint="eastAsia"/>
+        </w:rPr>
+        <w:t>↓</w:t>
+      </w:r>
+    </w:p>
+    <w:p>
+      <w:pPr>
+        <w:pStyle w:val="ListBullet"/>
+        <w:numPr>
+          <w:ilvl w:val="0"/>
+          <w:numId w:val="0"/>
+        </w:numPr>
+        <w:spacing w:after="0" w:line="240" w:lineRule="auto"/>
+      </w:pPr>
+      <w:proofErr w:type="spellStart"/>
+      <w:r>
+        <w:t>plant_reference_uses</w:t>
+      </w:r>
+      <w:proofErr w:type="spellEnd"/>
+    </w:p>
+    <w:p>
+      <w:pPr>
+        <w:pStyle w:val="ListBullet"/>
+        <w:numPr>
+          <w:ilvl w:val="0"/>
+          <w:numId w:val="0"/>
+        </w:numPr>
+        <w:spacing w:after="0" w:line="240" w:lineRule="auto"/>
+      </w:pPr>
+    </w:p>
+    <w:p>
+      <w:pPr>
+        <w:pStyle w:val="ListBullet"/>
+        <w:numPr>
+          <w:ilvl w:val="0"/>
+          <w:numId w:val="0"/>
+        </w:numPr>
+        <w:spacing w:after="0" w:line="240" w:lineRule="auto"/>
+      </w:pPr>
+      <w:r>
+        <w:t xml:space="preserve">Stage </w:t>
+      </w:r>
+      <w:proofErr w:type="gramStart"/>
+      <w:r>
+        <w:t>22  Use</w:t>
+      </w:r>
+      <w:proofErr w:type="gramEnd"/>
+      <w:r>
+        <w:t>-Term Normalization</w:t>
+      </w:r>
+    </w:p>
+    <w:p>
+      <w:pPr>
+        <w:pStyle w:val="ListBullet"/>
+        <w:numPr>
+          <w:ilvl w:val="0"/>
+          <w:numId w:val="0"/>
+        </w:numPr>
+        <w:spacing w:after="0" w:line="240" w:lineRule="auto"/>
+        <w:rPr>
+          <w:rFonts w:hint="eastAsia"/>
+        </w:rPr>
+      </w:pPr>
+      <w:r>
+        <w:rPr>
+          <w:rFonts w:hint="eastAsia"/>
+        </w:rPr>
+        <w:t xml:space="preserve">    </w:t>
+      </w:r>
+      <w:r>
+        <w:rPr>
+          <w:rFonts w:hint="eastAsia"/>
+        </w:rPr>
+        <w:t>↓</w:t>
+      </w:r>
+    </w:p>
+    <w:p>
+      <w:pPr>
+        <w:pStyle w:val="ListBullet"/>
+        <w:numPr>
+          <w:ilvl w:val="0"/>
+          <w:numId w:val="0"/>
+        </w:numPr>
+        <w:spacing w:after="0" w:line="240" w:lineRule="auto"/>
+      </w:pPr>
+      <w:proofErr w:type="spellStart"/>
+      <w:r>
+        <w:t>plant_reference_use_terms</w:t>
+      </w:r>
+      <w:proofErr w:type="spellEnd"/>
+    </w:p>
+    <w:p>
+      <w:pPr>
+        <w:pStyle w:val="ListBullet"/>
+        <w:numPr>
+          <w:ilvl w:val="0"/>
+          <w:numId w:val="0"/>
+        </w:numPr>
+        <w:spacing w:after="0" w:line="240" w:lineRule="auto"/>
+      </w:pPr>
+    </w:p>
+    <w:p>
+      <w:pPr>
+        <w:pStyle w:val="ListBullet"/>
+        <w:numPr>
+          <w:ilvl w:val="0"/>
+          <w:numId w:val="0"/>
+        </w:numPr>
+        <w:spacing w:after="0" w:line="240" w:lineRule="auto"/>
+      </w:pPr>
+      <w:r>
+        <w:t xml:space="preserve">Stage </w:t>
+      </w:r>
+      <w:proofErr w:type="gramStart"/>
+      <w:r>
+        <w:t>23  Safety</w:t>
+      </w:r>
+      <w:proofErr w:type="gramEnd"/>
+      <w:r>
+        <w:t xml:space="preserve"> Normalization</w:t>
+      </w:r>
+    </w:p>
+    <w:p>
+      <w:pPr>
+        <w:pStyle w:val="ListBullet"/>
+        <w:numPr>
+          <w:ilvl w:val="0"/>
+          <w:numId w:val="0"/>
+        </w:numPr>
+        <w:spacing w:after="0" w:line="240" w:lineRule="auto"/>
+        <w:rPr>
+          <w:rFonts w:hint="eastAsia"/>
+        </w:rPr>
+      </w:pPr>
+      <w:r>
+        <w:rPr>
+          <w:rFonts w:hint="eastAsia"/>
+        </w:rPr>
+        <w:t xml:space="preserve">    </w:t>
+      </w:r>
+      <w:r>
+        <w:rPr>
+          <w:rFonts w:hint="eastAsia"/>
+        </w:rPr>
+        <w:t>↓</w:t>
+      </w:r>
+    </w:p>
+    <w:p>
+      <w:pPr>
+        <w:pStyle w:val="ListBullet"/>
+        <w:numPr>
+          <w:ilvl w:val="0"/>
+          <w:numId w:val="0"/>
+        </w:numPr>
+        <w:spacing w:after="0" w:line="240" w:lineRule="auto"/>
+      </w:pPr>
+      <w:proofErr w:type="spellStart"/>
+      <w:r>
+        <w:t>plant_reference_safety</w:t>
+      </w:r>
+      <w:proofErr w:type="spellEnd"/>
+    </w:p>
+    <w:p>
+      <w:pPr>
+        <w:pStyle w:val="ListBullet"/>
+        <w:numPr>
+          <w:ilvl w:val="0"/>
+          <w:numId w:val="0"/>
+        </w:numPr>
+        <w:spacing w:after="0" w:line="240" w:lineRule="auto"/>
+      </w:pPr>
+    </w:p>
+    <w:p>
+      <w:pPr>
+        <w:pStyle w:val="ListBullet"/>
+        <w:numPr>
+          <w:ilvl w:val="0"/>
+          <w:numId w:val="0"/>
+        </w:numPr>
+        <w:spacing w:after="0" w:line="240" w:lineRule="auto"/>
+      </w:pPr>
+      <w:r>
+        <w:t xml:space="preserve">Stage </w:t>
+      </w:r>
+      <w:proofErr w:type="gramStart"/>
+      <w:r>
+        <w:t>24  Plant</w:t>
+      </w:r>
+      <w:proofErr w:type="gramEnd"/>
+      <w:r>
+        <w:t>-Part Extraction</w:t>
+      </w:r>
+    </w:p>
+    <w:p>
+      <w:pPr>
+        <w:pStyle w:val="ListBullet"/>
+        <w:numPr>
+          <w:ilvl w:val="0"/>
+          <w:numId w:val="0"/>
+        </w:numPr>
+        <w:spacing w:after="0" w:line="240" w:lineRule="auto"/>
+        <w:rPr>
+          <w:rFonts w:hint="eastAsia"/>
+        </w:rPr>
+      </w:pPr>
+      <w:r>
+        <w:rPr>
+          <w:rFonts w:hint="eastAsia"/>
+        </w:rPr>
+        <w:t xml:space="preserve">    </w:t>
+      </w:r>
+      <w:r>
+        <w:rPr>
+          <w:rFonts w:hint="eastAsia"/>
+        </w:rPr>
+        <w:t>↓</w:t>
+      </w:r>
+    </w:p>
+    <w:p>
+      <w:pPr>
+        <w:pStyle w:val="ListBullet"/>
+        <w:numPr>
+          <w:ilvl w:val="0"/>
+          <w:numId w:val="0"/>
+        </w:numPr>
+        <w:spacing w:after="0" w:line="240" w:lineRule="auto"/>
+      </w:pPr>
+      <w:proofErr w:type="spellStart"/>
+      <w:r>
+        <w:t>plant_reference_parts</w:t>
+      </w:r>
+      <w:proofErr w:type="spellEnd"/>
+    </w:p>
+    <w:p>
+      <w:pPr>
+        <w:pStyle w:val="ListBullet"/>
+        <w:numPr>
+          <w:ilvl w:val="0"/>
+          <w:numId w:val="0"/>
+        </w:numPr>
+        <w:spacing w:after="0" w:line="240" w:lineRule="auto"/>
+      </w:pPr>
+    </w:p>
+    <w:p>
+      <w:pPr>
+        <w:pStyle w:val="ListBullet"/>
+        <w:numPr>
+          <w:ilvl w:val="0"/>
+          <w:numId w:val="0"/>
+        </w:numPr>
+        <w:spacing w:after="0" w:line="240" w:lineRule="auto"/>
+      </w:pPr>
+      <w:r>
+        <w:t xml:space="preserve">Stage </w:t>
+      </w:r>
+      <w:proofErr w:type="gramStart"/>
+      <w:r>
+        <w:t>25  Reference</w:t>
+      </w:r>
+      <w:proofErr w:type="gramEnd"/>
+      <w:r>
+        <w:t xml:space="preserve"> View</w:t>
+      </w:r>
+    </w:p>
+    <w:p>
+      <w:pPr>
+        <w:pStyle w:val="ListBullet"/>
+        <w:numPr>
+          <w:ilvl w:val="0"/>
+          <w:numId w:val="0"/>
+        </w:numPr>
+        <w:spacing w:after="0" w:line="240" w:lineRule="auto"/>
+        <w:rPr>
+          <w:rFonts w:hint="eastAsia"/>
+        </w:rPr>
+      </w:pPr>
+      <w:r>
+        <w:rPr>
+          <w:rFonts w:hint="eastAsia"/>
+        </w:rPr>
+        <w:t xml:space="preserve">    </w:t>
+      </w:r>
+      <w:r>
+        <w:rPr>
+          <w:rFonts w:hint="eastAsia"/>
+        </w:rPr>
+        <w:t>↓</w:t>
+      </w:r>
+    </w:p>
+    <w:p>
+      <w:pPr>
+        <w:pStyle w:val="ListBullet"/>
+        <w:numPr>
+          <w:ilvl w:val="0"/>
+          <w:numId w:val="0"/>
+        </w:numPr>
+        <w:spacing w:after="0" w:line="240" w:lineRule="auto"/>
+      </w:pPr>
+      <w:proofErr w:type="spellStart"/>
+      <w:r>
+        <w:t>plant_reference_view</w:t>
+      </w:r>
+      <w:proofErr w:type="spellEnd"/>
     </w:p>
     <w:p>
       <w:pPr>
@@ -373,7 +819,15 @@
         <w:pStyle w:val="ListBullet"/>
       </w:pPr>
       <w:r>
-        <w:t>Use latin_name as join key.</w:t>
+        <w:t xml:space="preserve">Use </w:t>
+      </w:r>
+      <w:proofErr w:type="spellStart"/>
+      <w:r>
+        <w:t>latin_name</w:t>
+      </w:r>
+      <w:proofErr w:type="spellEnd"/>
+      <w:r>
+        <w:t xml:space="preserve"> as join key.</w:t>
       </w:r>
     </w:p>
     <w:p>
@@ -381,6 +835,7 @@
         <w:pStyle w:val="ListBullet"/>
       </w:pPr>
       <w:r>
+        <w:lastRenderedPageBreak/>
         <w:t>Build incrementally (one source at a time).</w:t>
       </w:r>
     </w:p>
@@ -427,7 +882,7 @@
 </file>
 
 <file path=word/numbering.xml><?xml version="1.0" encoding="utf-8"?>
-<w:numbering xmlns:wpc="http://schemas.microsoft.com/office/word/2010/wordprocessingCanvas" xmlns:cx="http://schemas.microsoft.com/office/drawing/2014/chartex" xmlns:cx1="http://schemas.microsoft.com/office/drawing/2015/9/8/chartex" xmlns:cx2="http://schemas.microsoft.com/office/drawing/2015/10/21/chartex" xmlns:cx3="http://schemas.microsoft.com/office/drawing/2016/5/9/chartex" xmlns:cx4="http://schemas.microsoft.com/office/drawing/2016/5/10/chartex" xmlns:cx5="http://schemas.microsoft.com/office/drawing/2016/5/11/chartex" xmlns:cx6="http://schemas.microsoft.com/office/drawing/2016/5/12/chartex" xmlns:cx7="http://schemas.microsoft.com/office/drawing/2016/5/13/chartex" xmlns:cx8="http://schemas.microsoft.com/office/drawing/2016/5/14/chartex" xmlns:mc="http://schemas.openxmlformats.org/markup-compatibility/2006" xmlns:aink="http://schemas.microsoft.com/office/drawing/2016/ink" xmlns:am3d="http://schemas.microsoft.com/office/drawing/2017/model3d" xmlns:o="urn:schemas-microsoft-com:office:office" xmlns:oel="http://schemas.microsoft.com/office/2019/extlst" xmlns:r="http://schemas.openxmlformats.org/officeDocument/2006/relationships" xmlns:m="http://schemas.openxmlformats.org/officeDocument/2006/math" xmlns:v="urn:schemas-microsoft-com:vml" xmlns:wp14="http://schemas.microsoft.com/office/word/2010/wordprocessingDrawing" xmlns:wp="http://schemas.openxmlformats.org/drawingml/2006/wordprocessingDrawing" xmlns:w10="urn:schemas-microsoft-com:office:word" xmlns:w="http://schemas.openxmlformats.org/wordprocessingml/2006/main" xmlns:w14="http://schemas.microsoft.com/office/word/2010/wordml" xmlns:w15="http://schemas.microsoft.com/office/word/2012/wordml" xmlns:w16cex="http://schemas.microsoft.com/office/word/2018/wordml/cex" xmlns:w16cid="http://schemas.microsoft.com/office/word/2016/wordml/cid" xmlns:w16="http://schemas.microsoft.com/office/word/2018/wordml" xmlns:w16du="http://schemas.microsoft.com/office/word/2023/wordml/word16du" xmlns:w16sdtdh="http://schemas.microsoft.com/office/word/2020/wordml/sdtdatahash" xmlns:w16sdtfl="http://schemas.microsoft.com/office/word/2024/wordml/sdtformatlock" xmlns:w16se="http://schemas.microsoft.com/office/word/2015/wordml/symex" xmlns:wpg="http://schemas.microsoft.com/office/word/2010/wordprocessingGroup" xmlns:wpi="http://schemas.microsoft.com/office/word/2010/wordprocessingInk" xmlns:wne="http://schemas.microsoft.com/office/word/2006/wordml" xmlns:wps="http://schemas.microsoft.com/office/word/2010/wordprocessingShape" mc:Ignorable="w14 w15 w16se w16cid w16 w16cex w16sdtdh w16sdtfl w16du wp14">
+<w:numbering xmlns:wpc="http://schemas.microsoft.com/office/word/2010/wordprocessingCanvas" xmlns:cx="http://schemas.microsoft.com/office/drawing/2014/chartex" xmlns:cx1="http://schemas.microsoft.com/office/drawing/2015/9/8/chartex" xmlns:cx2="http://schemas.microsoft.com/office/drawing/2015/10/21/chartex" xmlns:cx3="http://schemas.microsoft.com/office/drawing/2016/5/9/chartex" xmlns:cx4="http://schemas.microsoft.com/office/drawing/2016/5/10/chartex" xmlns:cx5="http://schemas.microsoft.com/office/drawing/2016/5/11/chartex" xmlns:cx6="http://schemas.microsoft.com/office/drawing/2016/5/12/chartex" xmlns:cx7="http://schemas.microsoft.com/office/drawing/2016/5/13/chartex" xmlns:cx8="http://schemas.microsoft.com/office/drawing/2016/5/14/chartex" xmlns:mc="http://schemas.openxmlformats.org/markup-compatibility/2006" xmlns:aink="http://schemas.microsoft.com/office/drawing/2016/ink" xmlns:am3d="http://schemas.microsoft.com/office/drawing/2017/model3d" xmlns:o="urn:schemas-microsoft-com:office:office" xmlns:oel="http://schemas.microsoft.com/office/2019/extlst" xmlns:r="http://schemas.openxmlformats.org/officeDocument/2006/relationships" xmlns:m="http://schemas.openxmlformats.org/officeDocument/2006/math" xmlns:v="urn:schemas-microsoft-com:vml" xmlns:wp14="http://schemas.microsoft.com/office/word/2010/wordprocessingDrawing" xmlns:wp="http://schemas.openxmlformats.org/drawingml/2006/wordprocessingDrawing" xmlns:w10="urn:schemas-microsoft-com:office:word" xmlns:w="http://schemas.openxmlformats.org/wordprocessingml/2006/main" xmlns:w14="http://schemas.microsoft.com/office/word/2010/wordml" xmlns:w15="http://schemas.microsoft.com/office/word/2012/wordml" xmlns:w16cei="http://schemas.microsoft.com/office/word/2026/wordml/cei" xmlns:w16cex="http://schemas.microsoft.com/office/word/2018/wordml/cex" xmlns:w16cid="http://schemas.microsoft.com/office/word/2016/wordml/cid" xmlns:w16="http://schemas.microsoft.com/office/word/2018/wordml" xmlns:w16du="http://schemas.microsoft.com/office/word/2023/wordml/word16du" xmlns:w16sdtdh="http://schemas.microsoft.com/office/word/2020/wordml/sdtdatahash" xmlns:w16sdtfl="http://schemas.microsoft.com/office/word/2024/wordml/sdtformatlock" xmlns:w16se="http://schemas.microsoft.com/office/word/2015/wordml/symex" xmlns:wpg="http://schemas.microsoft.com/office/word/2010/wordprocessingGroup" xmlns:wpi="http://schemas.microsoft.com/office/word/2010/wordprocessingInk" xmlns:wne="http://schemas.microsoft.com/office/word/2006/wordml" xmlns:wps="http://schemas.microsoft.com/office/word/2010/wordprocessingShape" mc:Ignorable="w14 w15 w16se w16cid w16 w16cex w16sdtdh w16sdtfl w16du wp14">
   <w:abstractNum w:abstractNumId="0" w15:restartNumberingAfterBreak="0">
     <w:nsid w:val="FFFFFF7C"/>
     <w:multiLevelType w:val="singleLevel"/>
@@ -625,6 +1080,12 @@
   </w:num>
   <w:num w:numId="9" w16cid:durableId="704255323">
     <w:abstractNumId w:val="0"/>
+  </w:num>
+  <w:num w:numId="10" w16cid:durableId="227082756">
+    <w:abstractNumId w:val="8"/>
+  </w:num>
+  <w:num w:numId="11" w16cid:durableId="1197156440">
+    <w:abstractNumId w:val="8"/>
   </w:num>
 </w:numbering>
 </file>
@@ -1232,7 +1693,6 @@
   <w:style w:type="character" w:default="1" w:styleId="DefaultParagraphFont">
     <w:name w:val="Default Paragraph Font"/>
     <w:uiPriority w:val="1"/>
-    <w:semiHidden/>
     <w:unhideWhenUsed/>
   </w:style>
   <w:style w:type="table" w:default="1" w:styleId="TableNormal">

</xml_diff>